<commit_message>
se actualiza lantilla de encargasdos
</commit_message>
<xml_diff>
--- a/templates/PLANTILLA_ENCARGADOS_CM.docx
+++ b/templates/PLANTILLA_ENCARGADOS_CM.docx
@@ -305,23 +305,114 @@
           <w:sz w:val="22"/>
           <w:szCs w:val="20"/>
         </w:rPr>
-        <w:t xml:space="preserve"> en </w:t>
-      </w:r>
-      <w:r>
-        <w:rPr>
-          <w:rFonts w:ascii="Garet" w:hAnsi="Garet" w:cs="Arial"/>
-          <w:sz w:val="22"/>
-          <w:szCs w:val="20"/>
-        </w:rPr>
-        <w:t>&lt;&lt;INSTITUCION&gt;&gt;</w:t>
-      </w:r>
-      <w:r>
-        <w:rPr>
-          <w:rFonts w:ascii="Garet" w:hAnsi="Garet" w:cs="Arial"/>
-          <w:sz w:val="22"/>
-          <w:szCs w:val="20"/>
-        </w:rPr>
-        <w:t>,</w:t>
+        <w:t xml:space="preserve"> </w:t>
+      </w:r>
+      <w:r>
+        <w:rPr>
+          <w:rFonts w:ascii="Garet" w:hAnsi="Garet" w:cs="Arial"/>
+          <w:sz w:val="22"/>
+          <w:szCs w:val="20"/>
+        </w:rPr>
+        <w:fldChar w:fldCharType="begin"/>
+      </w:r>
+      <w:r>
+        <w:rPr>
+          <w:rFonts w:ascii="Garet" w:hAnsi="Garet" w:cs="Arial"/>
+          <w:sz w:val="22"/>
+          <w:szCs w:val="20"/>
+        </w:rPr>
+        <w:instrText xml:space="preserve"> IF</w:instrText>
+      </w:r>
+      <w:r>
+        <w:rPr>
+          <w:rFonts w:ascii="Garet" w:hAnsi="Garet" w:cs="Arial"/>
+          <w:sz w:val="22"/>
+          <w:szCs w:val="20"/>
+        </w:rPr>
+        <w:instrText xml:space="preserve"> </w:instrText>
+      </w:r>
+      <w:r>
+        <w:rPr>
+          <w:rFonts w:ascii="Garet" w:hAnsi="Garet" w:cs="Arial"/>
+          <w:sz w:val="22"/>
+          <w:szCs w:val="20"/>
+        </w:rPr>
+        <w:fldChar w:fldCharType="begin"/>
+      </w:r>
+      <w:r>
+        <w:rPr>
+          <w:rFonts w:ascii="Garet" w:hAnsi="Garet" w:cs="Arial"/>
+          <w:sz w:val="22"/>
+          <w:szCs w:val="20"/>
+        </w:rPr>
+        <w:instrText xml:space="preserve"> </w:instrText>
+      </w:r>
+      <w:r>
+        <w:rPr>
+          <w:rFonts w:ascii="Garet" w:hAnsi="Garet" w:cs="Arial"/>
+          <w:sz w:val="22"/>
+          <w:szCs w:val="20"/>
+        </w:rPr>
+        <w:instrText>MERGEFIELD INSTITUCION } &lt;&gt; "" "en { MERGEFIELD INSTITUCION</w:instrText>
+      </w:r>
+      <w:r>
+        <w:rPr>
+          <w:rFonts w:ascii="Garet" w:hAnsi="Garet" w:cs="Arial"/>
+          <w:sz w:val="22"/>
+          <w:szCs w:val="20"/>
+        </w:rPr>
+        <w:instrText xml:space="preserve"> </w:instrText>
+      </w:r>
+      <w:r>
+        <w:rPr>
+          <w:rFonts w:ascii="Garet" w:hAnsi="Garet" w:cs="Arial"/>
+          <w:sz w:val="22"/>
+          <w:szCs w:val="20"/>
+        </w:rPr>
+        <w:fldChar w:fldCharType="separate"/>
+      </w:r>
+      <w:r>
+        <w:rPr>
+          <w:rFonts w:ascii="Garet" w:hAnsi="Garet" w:cs="Arial"/>
+          <w:sz w:val="22"/>
+          <w:szCs w:val="20"/>
+        </w:rPr>
+        <w:fldChar w:fldCharType="end"/>
+      </w:r>
+      <w:r>
+        <w:instrText xml:space="preserve"> </w:instrText>
+      </w:r>
+      <w:r>
+        <w:rPr>
+          <w:rFonts w:ascii="Garet" w:hAnsi="Garet" w:cs="Arial"/>
+          <w:sz w:val="22"/>
+          <w:szCs w:val="20"/>
+        </w:rPr>
+        <w:instrText xml:space="preserve">, " "" </w:instrText>
+      </w:r>
+      <w:r>
+        <w:rPr>
+          <w:rFonts w:ascii="Garet" w:hAnsi="Garet" w:cs="Arial"/>
+          <w:sz w:val="22"/>
+          <w:szCs w:val="20"/>
+        </w:rPr>
+        <w:instrText xml:space="preserve"> </w:instrText>
+      </w:r>
+      <w:r>
+        <w:rPr>
+          <w:rFonts w:ascii="Garet" w:hAnsi="Garet" w:cs="Arial"/>
+          <w:sz w:val="22"/>
+          <w:szCs w:val="20"/>
+        </w:rPr>
+        <w:fldChar w:fldCharType="separate"/>
+      </w:r>
+      <w:r>
+        <w:rPr>
+          <w:rFonts w:ascii="Garet" w:hAnsi="Garet" w:cs="Arial"/>
+          <w:sz w:val="22"/>
+          <w:szCs w:val="20"/>
+        </w:rPr>
+        <w:fldChar w:fldCharType="end"/>
       </w:r>
       <w:r>
         <w:rPr>
@@ -1799,7 +1890,6 @@
   <w:style w:type="character" w:default="1" w:styleId="Fuentedeprrafopredeter">
     <w:name w:val="Default Paragraph Font"/>
     <w:uiPriority w:val="1"/>
-    <w:semiHidden/>
     <w:unhideWhenUsed/>
   </w:style>
   <w:style w:type="table" w:default="1" w:styleId="Tablanormal">

</xml_diff>

<commit_message>
re arregal el bugg de las constancias de encargados
</commit_message>
<xml_diff>
--- a/templates/PLANTILLA_ENCARGADOS_CM.docx
+++ b/templates/PLANTILLA_ENCARGADOS_CM.docx
@@ -53,8 +53,19 @@
           <w:sz w:val="20"/>
           <w:szCs w:val="20"/>
         </w:rPr>
-        <w:t xml:space="preserve">Guadalajara, Jalisco, a </w:t>
-      </w:r>
+        <w:t xml:space="preserve">Guadalajara, Jalisco, a &lt;&lt;FECHA&gt;&gt;</w:t>
+      </w:r>
+    </w:p>
+    <w:p>
+      <w:pPr>
+        <w:spacing w:after="0" w:line="240" w:lineRule="auto"/>
+        <w:jc w:val="right"/>
+        <w:rPr>
+          <w:rFonts w:ascii="Garet" w:hAnsi="Garet" w:cs="Arial"/>
+          <w:sz w:val="20"/>
+          <w:szCs w:val="20"/>
+        </w:rPr>
+      </w:pPr>
       <w:r>
         <w:rPr>
           <w:rFonts w:ascii="Garet" w:hAnsi="Garet" w:cs="Arial"/>
@@ -62,36 +73,7 @@
           <w:sz w:val="20"/>
           <w:szCs w:val="20"/>
         </w:rPr>
-        <w:t>&lt;&lt;FECHA&gt;&gt;</w:t>
-      </w:r>
-    </w:p>
-    <w:p>
-      <w:pPr>
-        <w:spacing w:after="0" w:line="240" w:lineRule="auto"/>
-        <w:jc w:val="right"/>
-        <w:rPr>
-          <w:rFonts w:ascii="Garet" w:hAnsi="Garet" w:cs="Arial"/>
-          <w:sz w:val="20"/>
-          <w:szCs w:val="20"/>
-        </w:rPr>
-      </w:pPr>
-      <w:r>
-        <w:rPr>
-          <w:rFonts w:ascii="Garet" w:hAnsi="Garet" w:cs="Arial"/>
-          <w:b/>
-          <w:sz w:val="20"/>
-          <w:szCs w:val="20"/>
-        </w:rPr>
-        <w:t xml:space="preserve">Oficio: </w:t>
-      </w:r>
-      <w:r>
-        <w:rPr>
-          <w:rFonts w:ascii="Garet" w:hAnsi="Garet" w:cs="Arial"/>
-          <w:b/>
-          <w:sz w:val="20"/>
-          <w:szCs w:val="20"/>
-        </w:rPr>
-        <w:t>&lt;&lt;OFICIO&gt;&gt;</w:t>
+        <w:t xml:space="preserve">Oficio: &lt;&lt;OFICIO&gt;&gt;</w:t>
       </w:r>
     </w:p>
     <w:p>
@@ -140,17 +122,20 @@
           <w:szCs w:val="20"/>
         </w:rPr>
         <w:t>&lt;&lt;NOMBRE_COMPLETO&gt;&gt;</w:t>
-      </w:r>
-      <w:r>
+        <w:br/>
+        <w:t xml:space="preserve">ASESOR DE LA DIRECCIÓN DE FORMACIÓN CONTINUA</w:t>
+      </w:r>
+    </w:p>
+    <w:p>
+      <w:pPr>
+        <w:spacing w:after="0" w:line="240" w:lineRule="auto"/>
         <w:rPr>
           <w:rFonts w:ascii="Garet" w:hAnsi="Garet" w:cs="Arial"/>
           <w:b/>
           <w:sz w:val="22"/>
           <w:szCs w:val="20"/>
         </w:rPr>
-        <w:br/>
-        <w:t>ASESOR</w:t>
-      </w:r>
+      </w:pPr>
       <w:r>
         <w:rPr>
           <w:rFonts w:ascii="Garet" w:hAnsi="Garet" w:cs="Arial"/>
@@ -158,47 +143,18 @@
           <w:sz w:val="22"/>
           <w:szCs w:val="20"/>
         </w:rPr>
-        <w:t xml:space="preserve"> </w:t>
-      </w:r>
-      <w:r>
+        <w:t>P R E S E N T E</w:t>
+      </w:r>
+    </w:p>
+    <w:p>
+      <w:pPr>
+        <w:spacing w:after="0" w:line="240" w:lineRule="auto"/>
         <w:rPr>
           <w:rFonts w:ascii="Garet" w:hAnsi="Garet" w:cs="Arial"/>
           <w:b/>
           <w:sz w:val="22"/>
           <w:szCs w:val="20"/>
         </w:rPr>
-        <w:t>DE LA DIRECCIÓN DE FORMACIÓN CONTINUA</w:t>
-      </w:r>
-    </w:p>
-    <w:p>
-      <w:pPr>
-        <w:spacing w:after="0" w:line="240" w:lineRule="auto"/>
-        <w:rPr>
-          <w:rFonts w:ascii="Garet" w:hAnsi="Garet" w:cs="Arial"/>
-          <w:b/>
-          <w:sz w:val="22"/>
-          <w:szCs w:val="20"/>
-        </w:rPr>
-      </w:pPr>
-      <w:r>
-        <w:rPr>
-          <w:rFonts w:ascii="Garet" w:hAnsi="Garet" w:cs="Arial"/>
-          <w:b/>
-          <w:sz w:val="22"/>
-          <w:szCs w:val="20"/>
-        </w:rPr>
-        <w:t>P R E S E N T E</w:t>
-      </w:r>
-    </w:p>
-    <w:p>
-      <w:pPr>
-        <w:spacing w:after="0" w:line="240" w:lineRule="auto"/>
-        <w:rPr>
-          <w:rFonts w:ascii="Garet" w:hAnsi="Garet" w:cs="Arial"/>
-          <w:b/>
-          <w:sz w:val="22"/>
-          <w:szCs w:val="20"/>
-        </w:rPr>
       </w:pPr>
     </w:p>
     <w:p>
@@ -217,282 +173,7 @@
           <w:sz w:val="22"/>
           <w:szCs w:val="20"/>
         </w:rPr>
-        <w:t>Con un cordial saludo me dirijo a usted para comunicarle que, en función de las actividades que se</w:t>
-      </w:r>
-      <w:r>
-        <w:rPr>
-          <w:rFonts w:ascii="Garet" w:hAnsi="Garet" w:cs="Arial"/>
-          <w:sz w:val="22"/>
-          <w:szCs w:val="20"/>
-        </w:rPr>
-        <w:t xml:space="preserve"> </w:t>
-      </w:r>
-      <w:r>
-        <w:rPr>
-          <w:rFonts w:ascii="Garet" w:hAnsi="Garet" w:cs="Arial"/>
-          <w:sz w:val="22"/>
-          <w:szCs w:val="20"/>
-        </w:rPr>
-        <w:t>realizan para fortalecer</w:t>
-      </w:r>
-      <w:r>
-        <w:rPr>
-          <w:rFonts w:ascii="Garet" w:hAnsi="Garet" w:cs="Arial"/>
-          <w:sz w:val="22"/>
-          <w:szCs w:val="20"/>
-        </w:rPr>
-        <w:t xml:space="preserve"> </w:t>
-      </w:r>
-      <w:r>
-        <w:rPr>
-          <w:rFonts w:ascii="Garet" w:hAnsi="Garet" w:cs="Arial"/>
-          <w:sz w:val="22"/>
-          <w:szCs w:val="20"/>
-        </w:rPr>
-        <w:t xml:space="preserve">la formación continua de los docentes en Jalisco, a partir del </w:t>
-      </w:r>
-      <w:r>
-        <w:rPr>
-          <w:rFonts w:ascii="Garet" w:hAnsi="Garet" w:cs="Arial"/>
-          <w:sz w:val="22"/>
-          <w:szCs w:val="20"/>
-        </w:rPr>
-        <w:t>&lt;&lt;FECHA_INICIO&gt;&gt;</w:t>
-      </w:r>
-      <w:r>
-        <w:rPr>
-          <w:rFonts w:ascii="Garet" w:hAnsi="Garet" w:cs="Arial"/>
-          <w:sz w:val="22"/>
-          <w:szCs w:val="20"/>
-        </w:rPr>
-        <w:t xml:space="preserve"> y hasta el </w:t>
-      </w:r>
-      <w:r>
-        <w:rPr>
-          <w:rFonts w:ascii="Garet" w:hAnsi="Garet" w:cs="Arial"/>
-          <w:sz w:val="22"/>
-          <w:szCs w:val="20"/>
-        </w:rPr>
-        <w:t>&lt;&lt;FECHA_FIN&gt;&gt;</w:t>
-      </w:r>
-      <w:r>
-        <w:rPr>
-          <w:rFonts w:ascii="Garet" w:hAnsi="Garet" w:cs="Arial"/>
-          <w:sz w:val="22"/>
-          <w:szCs w:val="20"/>
-        </w:rPr>
-        <w:t xml:space="preserve">, se le comisiona con sus horas de adscripción de esta dirección, al </w:t>
-      </w:r>
-      <w:r>
-        <w:rPr>
-          <w:rFonts w:ascii="Garet" w:hAnsi="Garet" w:cs="Arial"/>
-          <w:sz w:val="22"/>
-          <w:szCs w:val="20"/>
-        </w:rPr>
-        <w:t>&lt;&lt;CENTRO_MAESTROS&gt;&gt;</w:t>
-      </w:r>
-      <w:r>
-        <w:rPr>
-          <w:rFonts w:ascii="Garet" w:hAnsi="Garet" w:cs="Arial"/>
-          <w:sz w:val="22"/>
-          <w:szCs w:val="20"/>
-        </w:rPr>
-        <w:t>, ubicado</w:t>
-      </w:r>
-      <w:r>
-        <w:rPr>
-          <w:rFonts w:ascii="Garet" w:hAnsi="Garet" w:cs="Arial"/>
-          <w:sz w:val="22"/>
-          <w:szCs w:val="20"/>
-        </w:rPr>
-        <w:t xml:space="preserve"> </w:t>
-      </w:r>
-      <w:r>
-        <w:rPr>
-          <w:rFonts w:ascii="Garet" w:hAnsi="Garet" w:cs="Arial"/>
-          <w:sz w:val="22"/>
-          <w:szCs w:val="20"/>
-        </w:rPr>
-        <w:fldChar w:fldCharType="begin"/>
-      </w:r>
-      <w:r>
-        <w:rPr>
-          <w:rFonts w:ascii="Garet" w:hAnsi="Garet" w:cs="Arial"/>
-          <w:sz w:val="22"/>
-          <w:szCs w:val="20"/>
-        </w:rPr>
-        <w:instrText xml:space="preserve"> IF</w:instrText>
-      </w:r>
-      <w:r>
-        <w:rPr>
-          <w:rFonts w:ascii="Garet" w:hAnsi="Garet" w:cs="Arial"/>
-          <w:sz w:val="22"/>
-          <w:szCs w:val="20"/>
-        </w:rPr>
-        <w:instrText xml:space="preserve"> </w:instrText>
-      </w:r>
-      <w:r>
-        <w:rPr>
-          <w:rFonts w:ascii="Garet" w:hAnsi="Garet" w:cs="Arial"/>
-          <w:sz w:val="22"/>
-          <w:szCs w:val="20"/>
-        </w:rPr>
-        <w:fldChar w:fldCharType="begin"/>
-      </w:r>
-      <w:r>
-        <w:rPr>
-          <w:rFonts w:ascii="Garet" w:hAnsi="Garet" w:cs="Arial"/>
-          <w:sz w:val="22"/>
-          <w:szCs w:val="20"/>
-        </w:rPr>
-        <w:instrText xml:space="preserve"> </w:instrText>
-      </w:r>
-      <w:r>
-        <w:rPr>
-          <w:rFonts w:ascii="Garet" w:hAnsi="Garet" w:cs="Arial"/>
-          <w:sz w:val="22"/>
-          <w:szCs w:val="20"/>
-        </w:rPr>
-        <w:instrText>MERGEFIELD INSTITUCION } &lt;&gt; "" "en { MERGEFIELD INSTITUCION</w:instrText>
-      </w:r>
-      <w:r>
-        <w:rPr>
-          <w:rFonts w:ascii="Garet" w:hAnsi="Garet" w:cs="Arial"/>
-          <w:sz w:val="22"/>
-          <w:szCs w:val="20"/>
-        </w:rPr>
-        <w:instrText xml:space="preserve"> </w:instrText>
-      </w:r>
-      <w:r>
-        <w:rPr>
-          <w:rFonts w:ascii="Garet" w:hAnsi="Garet" w:cs="Arial"/>
-          <w:sz w:val="22"/>
-          <w:szCs w:val="20"/>
-        </w:rPr>
-        <w:fldChar w:fldCharType="separate"/>
-      </w:r>
-      <w:r>
-        <w:rPr>
-          <w:rFonts w:ascii="Garet" w:hAnsi="Garet" w:cs="Arial"/>
-          <w:sz w:val="22"/>
-          <w:szCs w:val="20"/>
-        </w:rPr>
-        <w:fldChar w:fldCharType="end"/>
-      </w:r>
-      <w:r>
-        <w:instrText xml:space="preserve"> </w:instrText>
-      </w:r>
-      <w:r>
-        <w:rPr>
-          <w:rFonts w:ascii="Garet" w:hAnsi="Garet" w:cs="Arial"/>
-          <w:sz w:val="22"/>
-          <w:szCs w:val="20"/>
-        </w:rPr>
-        <w:instrText xml:space="preserve">, " "" </w:instrText>
-      </w:r>
-      <w:r>
-        <w:rPr>
-          <w:rFonts w:ascii="Garet" w:hAnsi="Garet" w:cs="Arial"/>
-          <w:sz w:val="22"/>
-          <w:szCs w:val="20"/>
-        </w:rPr>
-        <w:instrText xml:space="preserve"> </w:instrText>
-      </w:r>
-      <w:r>
-        <w:rPr>
-          <w:rFonts w:ascii="Garet" w:hAnsi="Garet" w:cs="Arial"/>
-          <w:sz w:val="22"/>
-          <w:szCs w:val="20"/>
-        </w:rPr>
-        <w:fldChar w:fldCharType="separate"/>
-      </w:r>
-      <w:r>
-        <w:rPr>
-          <w:rFonts w:ascii="Garet" w:hAnsi="Garet" w:cs="Arial"/>
-          <w:sz w:val="22"/>
-          <w:szCs w:val="20"/>
-        </w:rPr>
-        <w:fldChar w:fldCharType="end"/>
-      </w:r>
-      <w:r>
-        <w:rPr>
-          <w:rFonts w:ascii="Garet" w:hAnsi="Garet" w:cs="Arial"/>
-          <w:sz w:val="22"/>
-          <w:szCs w:val="20"/>
-        </w:rPr>
-        <w:t xml:space="preserve"> </w:t>
-      </w:r>
-      <w:r>
-        <w:rPr>
-          <w:rFonts w:ascii="Garet" w:hAnsi="Garet" w:cs="Arial"/>
-          <w:sz w:val="22"/>
-          <w:szCs w:val="20"/>
-        </w:rPr>
-        <w:t xml:space="preserve">calle </w:t>
-      </w:r>
-      <w:r>
-        <w:rPr>
-          <w:rFonts w:ascii="Garet" w:hAnsi="Garet" w:cs="Arial"/>
-          <w:sz w:val="22"/>
-          <w:szCs w:val="20"/>
-        </w:rPr>
-        <w:t>&lt;&lt;DOMICILIO&gt;&gt;</w:t>
-      </w:r>
-      <w:r>
-        <w:rPr>
-          <w:rFonts w:ascii="Garet" w:hAnsi="Garet" w:cs="Arial"/>
-          <w:sz w:val="22"/>
-          <w:szCs w:val="20"/>
-        </w:rPr>
-        <w:t xml:space="preserve"> Col</w:t>
-      </w:r>
-      <w:r>
-        <w:rPr>
-          <w:rFonts w:ascii="Garet" w:hAnsi="Garet" w:cs="Arial"/>
-          <w:sz w:val="22"/>
-          <w:szCs w:val="20"/>
-        </w:rPr>
-        <w:t>onia</w:t>
-      </w:r>
-      <w:r>
-        <w:rPr>
-          <w:rFonts w:ascii="Garet" w:hAnsi="Garet" w:cs="Arial"/>
-          <w:sz w:val="22"/>
-          <w:szCs w:val="20"/>
-        </w:rPr>
-        <w:t xml:space="preserve"> </w:t>
-      </w:r>
-      <w:r>
-        <w:rPr>
-          <w:rFonts w:ascii="Garet" w:hAnsi="Garet" w:cs="Arial"/>
-          <w:sz w:val="22"/>
-          <w:szCs w:val="20"/>
-        </w:rPr>
-        <w:t>&lt;&lt;COLONIA&gt;&gt;</w:t>
-      </w:r>
-      <w:r>
-        <w:rPr>
-          <w:rFonts w:ascii="Garet" w:hAnsi="Garet" w:cs="Arial"/>
-          <w:sz w:val="22"/>
-          <w:szCs w:val="20"/>
-        </w:rPr>
-        <w:t xml:space="preserve">, en el municipio de </w:t>
-      </w:r>
-      <w:r>
-        <w:rPr>
-          <w:rFonts w:ascii="Garet" w:hAnsi="Garet" w:cs="Arial"/>
-          <w:sz w:val="22"/>
-          <w:szCs w:val="20"/>
-        </w:rPr>
-        <w:t>&lt;&lt;MUNICIPIO&gt;&gt;</w:t>
-      </w:r>
-      <w:r>
-        <w:rPr>
-          <w:rFonts w:ascii="Garet" w:hAnsi="Garet" w:cs="Arial"/>
-          <w:sz w:val="22"/>
-          <w:szCs w:val="20"/>
-        </w:rPr>
-        <w:t>, Jalisco. Con el propósito de coordinar las actividades en dicha sede.</w:t>
+        <w:t xml:space="preserve">Con un cordial saludo me dirijo a usted para comunicarle que, en función de las actividades que se realizan para fortalecer la formación continua de los docentes en Jalisco, a partir del &lt;&lt;FECHA_INICIO&gt;&gt; y hasta el &lt;&lt;FECHA_FIN&gt;&gt;, se le comisiona con sus horas de adscripción de esta dirección, al &lt;&lt;CENTRO_MAESTROS&gt;&gt;, &lt;&lt;UBICACION&gt;&gt;. Con el propósito de coordinar las actividades en dicha sede.</w:t>
       </w:r>
     </w:p>
     <w:p>
@@ -557,15 +238,7 @@
           <w:sz w:val="22"/>
           <w:szCs w:val="20"/>
         </w:rPr>
-        <w:t>La organización de los procesos formativos</w:t>
-      </w:r>
-      <w:r>
-        <w:rPr>
-          <w:rFonts w:ascii="Garet" w:hAnsi="Garet" w:cs="Arial"/>
-          <w:sz w:val="22"/>
-          <w:szCs w:val="20"/>
-        </w:rPr>
-        <w:t>.</w:t>
+        <w:t>La organización de los procesos formativos.</w:t>
       </w:r>
     </w:p>
     <w:p>
@@ -842,13 +515,6 @@
           <w:szCs w:val="20"/>
         </w:rPr>
         <w:t xml:space="preserve">ENCARGADA DEL DESPACHO DE LA </w:t>
-      </w:r>
-      <w:r>
-        <w:rPr>
-          <w:rFonts w:ascii="Garet" w:hAnsi="Garet" w:cs="Arial"/>
-          <w:sz w:val="20"/>
-          <w:szCs w:val="20"/>
-        </w:rPr>
         <w:br/>
         <w:t>DIRECCIÓN DE FORMACIÓN CONTINUA</w:t>
       </w:r>
@@ -897,25 +563,7 @@
           <w:szCs w:val="10"/>
           <w:lang w:val="es-ES"/>
         </w:rPr>
-        <w:t xml:space="preserve">Este documento puede contener datos personales </w:t>
-      </w:r>
-      <w:r>
-        <w:rPr>
-          <w:rFonts w:ascii="Garet" w:hAnsi="Garet" w:cs="Arial"/>
-          <w:sz w:val="10"/>
-          <w:szCs w:val="10"/>
-          <w:lang w:val="es-ES"/>
-        </w:rPr>
-        <w:t>de acuerdo con</w:t>
-      </w:r>
-      <w:r>
-        <w:rPr>
-          <w:rFonts w:ascii="Garet" w:hAnsi="Garet" w:cs="Arial"/>
-          <w:sz w:val="10"/>
-          <w:szCs w:val="10"/>
-          <w:lang w:val="es-ES"/>
-        </w:rPr>
-        <w:t xml:space="preserve"> lo establecido en el artículo 3, fracciones IX y X de la Ley de Protección de Datos Personales en Posesión de Sujetos Obligados del Estado de Jalisco y sus Municipios, así como información confidencial de conformidad al artículo 21 de la Ley de Transparencia y Acceso a la Información Pública del Estado de Jalisco y sus Municipios.</w:t>
+        <w:t xml:space="preserve">Este documento puede contener datos personales de acuerdo con lo establecido en el artículo 3, fracciones IX y X de la Ley de Protección de Datos Personales en Posesión de Sujetos Obligados del Estado de Jalisco y sus Municipios, así como información confidencial de conformidad al artículo 21 de la Ley de Transparencia y Acceso a la Información Pública del Estado de Jalisco y sus Municipios.</w:t>
       </w:r>
     </w:p>
     <w:p>
@@ -1890,6 +1538,7 @@
   <w:style w:type="character" w:default="1" w:styleId="Fuentedeprrafopredeter">
     <w:name w:val="Default Paragraph Font"/>
     <w:uiPriority w:val="1"/>
+    <w:semiHidden/>
     <w:unhideWhenUsed/>
   </w:style>
   <w:style w:type="table" w:default="1" w:styleId="Tablanormal">

</xml_diff>